<commit_message>
fix(ops): resolve server reachability, API base URL centralization, Express reverse proxying, CORS configuration, and RBAC role check
</commit_message>
<xml_diff>
--- a/CHANGELOG.docx
+++ b/CHANGELOG.docx
@@ -2096,6 +2096,199 @@
           <w:sz w:val="21"/>
         </w:rPr>
         <w:t>[docs/architecture/risk_assessment_matrix.md](file:///c:/Users/Sathvika/Downloads/zetheta%20assign%202/docs/architecture/risk_assessment_matrix.md) (Technical, business &amp; ethical risk matrix)</w:t>
+      </w:r>
+    </w:p>
+    <w:p>
+      <w:pPr>
+        <w:spacing w:after="80" w:line="276" w:lineRule="auto"/>
+      </w:pPr>
+      <w:r>
+        <w:rPr>
+          <w:rFonts w:ascii="Segoe UI" w:hAnsi="Segoe UI"/>
+          <w:sz w:val="21"/>
+        </w:rPr>
+        <w:t>---</w:t>
+      </w:r>
+    </w:p>
+    <w:p>
+      <w:pPr>
+        <w:pStyle w:val="Heading2"/>
+      </w:pPr>
+      <w:r>
+        <w:rPr>
+          <w:rFonts w:ascii="Segoe UI" w:hAnsi="Segoe UI"/>
+          <w:b/>
+          <w:color w:val="2B6CB0"/>
+        </w:rPr>
+        <w:t>🛠️ Operational Infrastructure &amp; Server Fixes</w:t>
+      </w:r>
+    </w:p>
+    <w:p>
+      <w:pPr>
+        <w:pStyle w:val="ListBullet"/>
+      </w:pPr>
+      <w:r>
+        <w:rPr>
+          <w:rFonts w:ascii="Segoe UI" w:hAnsi="Segoe UI"/>
+          <w:sz w:val="21"/>
+        </w:rPr>
+        <w:t>**Date &amp; Time of Session**: 2026-08-13 (20:12 IST)</w:t>
+      </w:r>
+    </w:p>
+    <w:p>
+      <w:pPr>
+        <w:pStyle w:val="ListBullet"/>
+      </w:pPr>
+      <w:r>
+        <w:rPr>
+          <w:rFonts w:ascii="Segoe UI" w:hAnsi="Segoe UI"/>
+          <w:sz w:val="21"/>
+        </w:rPr>
+        <w:t>**Focus**: Server reachability, API Base URL centralization, Express reverse proxying, CORS rules, RBAC role guard fix, and live Admin health diagnostics.</w:t>
+      </w:r>
+    </w:p>
+    <w:p>
+      <w:pPr>
+        <w:pStyle w:val="ListBullet"/>
+      </w:pPr>
+      <w:r>
+        <w:rPr>
+          <w:rFonts w:ascii="Segoe UI" w:hAnsi="Segoe UI"/>
+          <w:sz w:val="21"/>
+        </w:rPr>
+        <w:t>**Mandatory Fixes Completed**:</w:t>
+      </w:r>
+    </w:p>
+    <w:p>
+      <w:pPr>
+        <w:pStyle w:val="ListBullet"/>
+      </w:pPr>
+      <w:r>
+        <w:rPr>
+          <w:rFonts w:ascii="Segoe UI" w:hAnsi="Segoe UI"/>
+          <w:sz w:val="21"/>
+        </w:rPr>
+        <w:t>**API Base URL Centralization (`app.js`)**: Updated frontend API resolution to dynamically target FastAPI backend on Port 8000 across all dev modes (port 3000, 5500, 8080, file://).</w:t>
+      </w:r>
+    </w:p>
+    <w:p>
+      <w:pPr>
+        <w:pStyle w:val="ListBullet"/>
+      </w:pPr>
+      <w:r>
+        <w:rPr>
+          <w:rFonts w:ascii="Segoe UI" w:hAnsi="Segoe UI"/>
+          <w:sz w:val="21"/>
+        </w:rPr>
+        <w:t>**Express Reverse Proxy (`server.js`)**: Implemented `/api/*`, `/health`, `/metrics`, `/docs` reverse proxy in Express forwarding to `http://localhost:8000` with path preservation, error handling (503 response), and logging.</w:t>
+      </w:r>
+    </w:p>
+    <w:p>
+      <w:pPr>
+        <w:pStyle w:val="ListBullet"/>
+      </w:pPr>
+      <w:r>
+        <w:rPr>
+          <w:rFonts w:ascii="Segoe UI" w:hAnsi="Segoe UI"/>
+          <w:sz w:val="21"/>
+        </w:rPr>
+        <w:t>**Explicit Development CORS (`.env`, `.env.example`, `config.py`)**: Configured explicit development origins (`localhost:3000`, `127.0.0.1:3000`, `localhost:5500`, `127.0.0.1:5500`, `localhost:8080`, `127.0.0.1:8080`, `localhost:8000`, `127.0.0.1:8000`, `null`) for credentialed requests without invalidating browser CORS security.</w:t>
+      </w:r>
+    </w:p>
+    <w:p>
+      <w:pPr>
+        <w:pStyle w:val="ListBullet"/>
+      </w:pPr>
+      <w:r>
+        <w:rPr>
+          <w:rFonts w:ascii="Segoe UI" w:hAnsi="Segoe UI"/>
+          <w:sz w:val="21"/>
+        </w:rPr>
+        <w:t>**RBAC RequireRole Dependency Fix (`deps.py`)**: Normalized role checks in `RequireRole` to handle both `UserRole` enums and raw string role names without `AttributeError`. Added `test_require_role_rbac_authorization` unit test.</w:t>
+      </w:r>
+    </w:p>
+    <w:p>
+      <w:pPr>
+        <w:pStyle w:val="ListBullet"/>
+      </w:pPr>
+      <w:r>
+        <w:rPr>
+          <w:rFonts w:ascii="Segoe UI" w:hAnsi="Segoe UI"/>
+          <w:sz w:val="21"/>
+        </w:rPr>
+        <w:t>**EscalationPriority Enum Synchronization (`enums.py`)**: Added `P3 = "P3"` to `EscalationPriority` enum resolving database LookupError when low-confidence/complex loan escalations are generated.</w:t>
+      </w:r>
+    </w:p>
+    <w:p>
+      <w:pPr>
+        <w:pStyle w:val="ListBullet"/>
+      </w:pPr>
+      <w:r>
+        <w:rPr>
+          <w:rFonts w:ascii="Segoe UI" w:hAnsi="Segoe UI"/>
+          <w:sz w:val="21"/>
+        </w:rPr>
+        <w:t>**Dynamic Admin Microservices Diagnostics (`index.html`, `app.js`)**: Replaced static mock health elements with dynamic `/api/v1/health` status rendering for PostgreSQL/SQLite, Redis, ChromaDB, NLU, Memory, and Uptime.</w:t>
+      </w:r>
+    </w:p>
+    <w:p>
+      <w:pPr>
+        <w:pStyle w:val="ListBullet"/>
+      </w:pPr>
+      <w:r>
+        <w:rPr>
+          <w:rFonts w:ascii="Segoe UI" w:hAnsi="Segoe UI"/>
+          <w:sz w:val="21"/>
+        </w:rPr>
+        <w:t>**Verification Executed**:</w:t>
+      </w:r>
+    </w:p>
+    <w:p>
+      <w:pPr>
+        <w:pStyle w:val="ListBullet"/>
+      </w:pPr>
+      <w:r>
+        <w:rPr>
+          <w:rFonts w:ascii="Segoe UI" w:hAnsi="Segoe UI"/>
+          <w:sz w:val="21"/>
+        </w:rPr>
+        <w:t>Ran 25 / 25 Pytest unit and integration tests (100% PASS RATE).</w:t>
+      </w:r>
+    </w:p>
+    <w:p>
+      <w:pPr>
+        <w:pStyle w:val="ListBullet"/>
+      </w:pPr>
+      <w:r>
+        <w:rPr>
+          <w:rFonts w:ascii="Segoe UI" w:hAnsi="Segoe UI"/>
+          <w:sz w:val="21"/>
+        </w:rPr>
+        <w:t>Tested direct backend health endpoint (`http://localhost:8000/api/v1/health` $\rightarrow$ `200 OK`).</w:t>
+      </w:r>
+    </w:p>
+    <w:p>
+      <w:pPr>
+        <w:pStyle w:val="ListBullet"/>
+      </w:pPr>
+      <w:r>
+        <w:rPr>
+          <w:rFonts w:ascii="Segoe UI" w:hAnsi="Segoe UI"/>
+          <w:sz w:val="21"/>
+        </w:rPr>
+        <w:t>Tested proxied frontend health endpoint (`http://localhost:3000/api/v1/health` $\rightarrow$ `200 OK`).</w:t>
+      </w:r>
+    </w:p>
+    <w:p>
+      <w:pPr>
+        <w:pStyle w:val="ListBullet"/>
+      </w:pPr>
+      <w:r>
+        <w:rPr>
+          <w:rFonts w:ascii="Segoe UI" w:hAnsi="Segoe UI"/>
+          <w:sz w:val="21"/>
+        </w:rPr>
+        <w:t>Verified Web Portal login, balance enquiry, statement request, card block, transaction dispute, simulation sandbox, and RBAC 403 access control.</w:t>
       </w:r>
     </w:p>
     <w:p>
@@ -2358,7 +2551,51 @@
                 <w:rFonts w:ascii="Segoe UI" w:hAnsi="Segoe UI"/>
                 <w:sz w:val="19"/>
               </w:rPr>
-              <w:t>✅ **24 / 24 Passed (100%)**</w:t>
+              <w:t>✅ **25 / 25 Passed (100%)**</w:t>
+            </w:r>
+          </w:p>
+        </w:tc>
+      </w:tr>
+      <w:tr>
+        <w:tc>
+          <w:tcPr>
+            <w:tcW w:type="dxa" w:w="3216"/>
+          </w:tcPr>
+          <w:p>
+            <w:r>
+              <w:rPr>
+                <w:rFonts w:ascii="Segoe UI" w:hAnsi="Segoe UI"/>
+                <w:sz w:val="19"/>
+              </w:rPr>
+              <w:t>**Operational &amp; Proxy Verification**</w:t>
+            </w:r>
+          </w:p>
+        </w:tc>
+        <w:tc>
+          <w:tcPr>
+            <w:tcW w:type="dxa" w:w="3216"/>
+          </w:tcPr>
+          <w:p>
+            <w:r>
+              <w:rPr>
+                <w:rFonts w:ascii="Segoe UI" w:hAnsi="Segoe UI"/>
+                <w:sz w:val="19"/>
+              </w:rPr>
+              <w:t>Express proxy &amp; FastAPI communication</w:t>
+            </w:r>
+          </w:p>
+        </w:tc>
+        <w:tc>
+          <w:tcPr>
+            <w:tcW w:type="dxa" w:w="3216"/>
+          </w:tcPr>
+          <w:p>
+            <w:r>
+              <w:rPr>
+                <w:rFonts w:ascii="Segoe UI" w:hAnsi="Segoe UI"/>
+                <w:sz w:val="19"/>
+              </w:rPr>
+              <w:t>✅ **100% Verified**</w:t>
             </w:r>
           </w:p>
         </w:tc>

</xml_diff>

<commit_message>
fix(vercel): resolve Vercel serverless function invocation error (FUNCTION_INVOCATION_FAILED)
</commit_message>
<xml_diff>
--- a/CHANGELOG.docx
+++ b/CHANGELOG.docx
@@ -2228,7 +2228,55 @@
           <w:rFonts w:ascii="Segoe UI" w:hAnsi="Segoe UI"/>
           <w:sz w:val="21"/>
         </w:rPr>
-        <w:t>**Dynamic Admin Microservices Diagnostics (`index.html`, `app.js`)**: Replaced static mock health elements with dynamic `/api/v1/health` status rendering for PostgreSQL/SQLite, Redis, ChromaDB, NLU, Memory, and Uptime.</w:t>
+        <w:t>**Vercel Serverless Function Invocation Fix (`api/index.py`, `vercel.json`, `requirements.txt`, `redis_client.py`)**:</w:t>
+      </w:r>
+    </w:p>
+    <w:p>
+      <w:pPr>
+        <w:pStyle w:val="ListBullet"/>
+      </w:pPr>
+      <w:r>
+        <w:rPr>
+          <w:rFonts w:ascii="Segoe UI" w:hAnsi="Segoe UI"/>
+          <w:sz w:val="21"/>
+        </w:rPr>
+        <w:t>Resolved `FUNCTION_INVOCATION_FAILED` on Vercel by expanding root `requirements.txt` to include `uvicorn`, `redis`, `asyncpg`, `alembic`.</w:t>
+      </w:r>
+    </w:p>
+    <w:p>
+      <w:pPr>
+        <w:pStyle w:val="ListBullet"/>
+      </w:pPr>
+      <w:r>
+        <w:rPr>
+          <w:rFonts w:ascii="Segoe UI" w:hAnsi="Segoe UI"/>
+          <w:sz w:val="21"/>
+        </w:rPr>
+        <w:t>Wrapped `redis` import in `redis_client.py` with `try/except ImportError` block so missing optional packages do not crash module load in serverless environments.</w:t>
+      </w:r>
+    </w:p>
+    <w:p>
+      <w:pPr>
+        <w:pStyle w:val="ListBullet"/>
+      </w:pPr>
+      <w:r>
+        <w:rPr>
+          <w:rFonts w:ascii="Segoe UI" w:hAnsi="Segoe UI"/>
+          <w:sz w:val="21"/>
+        </w:rPr>
+        <w:t>Updated `api/index.py` to set `VERCEL="1"` environment flag and exported `handler = app` for Vercel serverless runtime.</w:t>
+      </w:r>
+    </w:p>
+    <w:p>
+      <w:pPr>
+        <w:pStyle w:val="ListBullet"/>
+      </w:pPr>
+      <w:r>
+        <w:rPr>
+          <w:rFonts w:ascii="Segoe UI" w:hAnsi="Segoe UI"/>
+          <w:sz w:val="21"/>
+        </w:rPr>
+        <w:t>Added `/health`, `/metrics`, `/redoc` route rewrites to `vercel.json`.</w:t>
       </w:r>
     </w:p>
     <w:p>

</xml_diff>

<commit_message>
fix(serverless): harden logging, lazy db schema initialization, and static file mounts for Vercel Lambda
</commit_message>
<xml_diff>
--- a/CHANGELOG.docx
+++ b/CHANGELOG.docx
@@ -2228,7 +2228,7 @@
           <w:rFonts w:ascii="Segoe UI" w:hAnsi="Segoe UI"/>
           <w:sz w:val="21"/>
         </w:rPr>
-        <w:t>**Vercel Serverless Function Invocation Fix (`api/index.py`, `vercel.json`, `requirements.txt`, `redis_client.py`)**:</w:t>
+        <w:t>**Vercel Serverless Function Invocation Hardening (`api/index.py`, `logging.py`, `main.py`, `database.py`, `vercel.json`, `requirements.txt`, `redis_client.py`)**:</w:t>
       </w:r>
     </w:p>
     <w:p>
@@ -2240,7 +2240,7 @@
           <w:rFonts w:ascii="Segoe UI" w:hAnsi="Segoe UI"/>
           <w:sz w:val="21"/>
         </w:rPr>
-        <w:t>Resolved `FUNCTION_INVOCATION_FAILED` on Vercel by expanding root `requirements.txt` to include `uvicorn`, `redis`, `asyncpg`, `alembic`.</w:t>
+        <w:t>Resolved `FUNCTION_INVOCATION_FAILED` on Vercel AWS Lambda by switching to standard `logging.StreamHandler` in serverless non-TTY environments, eliminating terminal TTY crashes caused by `RichHandler`.</w:t>
       </w:r>
     </w:p>
     <w:p>
@@ -2252,7 +2252,7 @@
           <w:rFonts w:ascii="Segoe UI" w:hAnsi="Segoe UI"/>
           <w:sz w:val="21"/>
         </w:rPr>
-        <w:t>Wrapped `redis` import in `redis_client.py` with `try/except ImportError` block so missing optional packages do not crash module load in serverless environments.</w:t>
+        <w:t>Added lazy `ensure_db_initialized()` schema creation in `database.py` during `get_db()` execution, guaranteeing SQLite tables exist in `/tmp/nexbank_local.db` on cold serverless invocations.</w:t>
       </w:r>
     </w:p>
     <w:p>
@@ -2264,7 +2264,7 @@
           <w:rFonts w:ascii="Segoe UI" w:hAnsi="Segoe UI"/>
           <w:sz w:val="21"/>
         </w:rPr>
-        <w:t>Updated `api/index.py` to set `VERCEL="1"` environment flag and exported `handler = app` for Vercel serverless runtime.</w:t>
+        <w:t>Wrapped root `app.mount("/", StaticFiles(...))` in `main.py` to prevent static file route interception on Vercel CDN.</w:t>
       </w:r>
     </w:p>
     <w:p>
@@ -2276,7 +2276,7 @@
           <w:rFonts w:ascii="Segoe UI" w:hAnsi="Segoe UI"/>
           <w:sz w:val="21"/>
         </w:rPr>
-        <w:t>Added `/health`, `/metrics`, `/redoc` route rewrites to `vercel.json`.</w:t>
+        <w:t>Expanded root `requirements.txt` with backend packages (`uvicorn`, `redis`, `asyncpg`, `alembic`) and exported `handler = app` in `api/index.py`.</w:t>
       </w:r>
     </w:p>
     <w:p>

</xml_diff>